<commit_message>
Programas de estudio: «tenedor» en vez de «horquilla», como en el resto del sitio
Co-Authored-By: Claude Opus 5.5 <noreply@anthropic.com>
Claude-Session: https://claude.ai/code/session_014bPvYcaqufyH8VsJCGHdF6
</commit_message>
<xml_diff>
--- a/material/programas-de-estudio/04 Cuarto año - Planeamiento Unidad 2 (lecciones 31 a 65).docx
+++ b/material/programas-de-estudio/04 Cuarto año - Planeamiento Unidad 2 (lecciones 31 a 65).docx
@@ -147,7 +147,7 @@
         <w:t>Propósito.</w:t>
       </w:r>
       <w:r>
-        <w:t xml:space="preserve"> Que la persona estudiante adquiera el hábito de revisar, antes de cada jugada, qué piezas propias y rivales están indefensas, y que aprenda el primer tema táctico del año: el ataque doble, con el caballo (la horquilla), el peón, la dama, el alfil, la torre y el rey. Se usan las unidades 6 y 7 de «Ajedrez en el aula 3», el ejemplo de ataque doble del Manual 2 y la partida Greco contra un aficionado (Italia, 1620) del Manual 3. Se inicia el cuaderno de táctica del proyecto del semestre. El eje de salud se trabaja con pausas activas entre partidas y la postura frente al tablero.</w:t>
+        <w:t xml:space="preserve"> Que la persona estudiante adquiera el hábito de revisar, antes de cada jugada, qué piezas propias y rivales están indefensas, y que aprenda el primer tema táctico del año: el ataque doble, con el caballo (el tenedor), el peón, la dama, el alfil, la torre y el rey. Se usan las unidades 6 y 7 de «Ajedrez en el aula 3», el ejemplo de ataque doble del Manual 2 y la partida Greco contra un aficionado (Italia, 1620) del Manual 3. Se inicia el cuaderno de táctica del proyecto del semestre. El eje de salud se trabaja con pausas activas entre partidas y la postura frente al tablero.</w:t>
       </w:r>
     </w:p>
     <w:p>
@@ -455,7 +455,7 @@
               <w:pStyle w:val="Celda8_5RXS"/>
             </w:pPr>
             <w:r>
-              <w:t>• 38. La horquilla de caballo</w:t>
+              <w:t>• 38. El tenedor de caballo</w:t>
             </w:r>
           </w:p>
           <w:p>
@@ -463,7 +463,7 @@
               <w:pStyle w:val="Celda8_5RXS"/>
             </w:pPr>
             <w:r>
-              <w:t>• 39. Horquilla con jaque: rey y dama</w:t>
+              <w:t>• 39. Tenedor con jaque: rey y dama</w:t>
             </w:r>
           </w:p>
           <w:p>
@@ -471,7 +471,7 @@
               <w:pStyle w:val="Celda8_5RXS"/>
             </w:pPr>
             <w:r>
-              <w:t>• 40. Buscar la casilla de la horquilla</w:t>
+              <w:t>• 40. Buscar la casilla del tenedor</w:t>
             </w:r>
           </w:p>
         </w:tc>
@@ -683,7 +683,7 @@
               <w:pStyle w:val="Celda8_5RXS"/>
             </w:pPr>
             <w:r>
-              <w:t>• 53. Vigilar las casillas de horquilla</w:t>
+              <w:t>• 53. Vigilar las casillas de tenedor</w:t>
             </w:r>
           </w:p>
           <w:p>
@@ -3388,7 +3388,7 @@
               <w:rPr>
                 <w:b/>
               </w:rPr>
-              <w:t>La horquilla de caballo</w:t>
+              <w:t>El tenedor de caballo</w:t>
             </w:r>
           </w:p>
         </w:tc>
@@ -3553,7 +3553,7 @@
             </w:pPr>
             <w:r/>
             <w:r>
-              <w:t>Se muestra que el caballo ataca casillas de color contrario al suyo, por eso solo puede atacar a la vez piezas que están en casillas del mismo color. Se nombra la horquilla.</w:t>
+              <w:t>Se muestra que el caballo ataca casillas de color contrario al suyo, por eso solo puede atacar a la vez piezas que están en casillas del mismo color. Se nombra el tenedor.</w:t>
             </w:r>
           </w:p>
         </w:tc>
@@ -3586,7 +3586,7 @@
             </w:pPr>
             <w:r/>
             <w:r>
-              <w:t>Para cerrar, cada estudiante dibuja en su cuaderno un caballo y dos piezas en una posición de horquilla.</w:t>
+              <w:t>Para cerrar, cada estudiante dibuja en su cuaderno un caballo y dos piezas en una posición de tenedor.</w:t>
             </w:r>
           </w:p>
         </w:tc>
@@ -3625,7 +3625,7 @@
               <w:t>Formativa.</w:t>
             </w:r>
             <w:r>
-              <w:t xml:space="preserve"> Revisión de los dibujos de horquilla en el cuaderno.</w:t>
+              <w:t xml:space="preserve"> Revisión de los dibujos de tenedor en el cuaderno.</w:t>
             </w:r>
           </w:p>
         </w:tc>
@@ -3734,7 +3734,7 @@
               <w:rPr>
                 <w:b/>
               </w:rPr>
-              <w:t>Horquilla con jaque: rey y dama</w:t>
+              <w:t>Tenedor con jaque: rey y dama</w:t>
             </w:r>
           </w:p>
         </w:tc>
@@ -3800,7 +3800,7 @@
             </w:pPr>
             <w:r/>
             <w:r>
-              <w:t>Reconocer la horquilla de caballo que ataca al rey y a otra pieza.</w:t>
+              <w:t>Reconocer el tenedor de caballo que ataca al rey y a otra pieza.</w:t>
             </w:r>
           </w:p>
         </w:tc>
@@ -3833,7 +3833,7 @@
             </w:pPr>
             <w:r/>
             <w:r>
-              <w:t>Se pregunta: «¿Por qué es peor una horquilla que da jaque?». Se escuchan ideas.</w:t>
+              <w:t>Se pregunta: «¿Por qué es peor un tenedor que da jaque?». Se escuchan ideas.</w:t>
             </w:r>
           </w:p>
         </w:tc>
@@ -3899,7 +3899,7 @@
             </w:pPr>
             <w:r/>
             <w:r>
-              <w:t>La persona docente explica que el jaque obliga a atender al rey primero y por eso la otra pieza cae. Se repasan en el tablero mural las casillas de horquilla más típicas cerca del enroque.</w:t>
+              <w:t>La persona docente explica que el jaque obliga a atender al rey primero y por eso la otra pieza cae. Se repasan en el tablero mural las casillas de tenedor más típicas cerca del enroque.</w:t>
             </w:r>
           </w:p>
         </w:tc>
@@ -3932,7 +3932,7 @@
             </w:pPr>
             <w:r/>
             <w:r>
-              <w:t>Partida de 10 minutos con consigna: cada horquilla que se logre se marca con «!» en la planilla.</w:t>
+              <w:t>Partida de 10 minutos con consigna: cada tenedor que se logre se marca con «!» en la planilla.</w:t>
             </w:r>
           </w:p>
         </w:tc>
@@ -3971,7 +3971,7 @@
               <w:t>Formativa.</w:t>
             </w:r>
             <w:r>
-              <w:t xml:space="preserve"> Revisión de las tarjetas y de las horquillas marcadas en la planilla.</w:t>
+              <w:t xml:space="preserve"> Revisión de las tarjetas y de los tenedores marcados en la planilla.</w:t>
             </w:r>
           </w:p>
         </w:tc>
@@ -4080,7 +4080,7 @@
               <w:rPr>
                 <w:b/>
               </w:rPr>
-              <w:t>Buscar la casilla de la horquilla</w:t>
+              <w:t>Buscar la casilla del tenedor</w:t>
             </w:r>
           </w:p>
         </w:tc>
@@ -4212,7 +4212,7 @@
             </w:pPr>
             <w:r/>
             <w:r>
-              <w:t>Juego de velocidad por equipos de tres: la persona docente coloca en el tablero mural un caballo blanco y dos piezas negras. El primer equipo que escribe la casilla de horquilla en su pizarra pequeña gana un punto. Se juegan diez montajes, algunos sin solución, en los que hay que escribir «no hay».</w:t>
+              <w:t>Juego de velocidad por equipos de tres: la persona docente coloca en el tablero mural un caballo blanco y dos piezas negras. El primer equipo que escribe la casilla de tenedor en su pizarra pequeña gana un punto. Se juegan diez montajes, algunos sin solución, en los que hay que escribir «no hay».</w:t>
             </w:r>
           </w:p>
         </w:tc>
@@ -7705,7 +7705,7 @@
             </w:pPr>
             <w:r/>
             <w:r>
-              <w:t>Quien llegó al nivel oro trabaja la hoja de ataques dobles que necesitan preparación; quien no, termina la hoja de plata con apoyo de la persona docente en una mesa aparte. En la mesa de apoyo se repasan las casillas de horquilla con el caballo.</w:t>
+              <w:t>Quien llegó al nivel oro trabaja la hoja de ataques dobles que necesitan preparación; quien no, termina la hoja de plata con apoyo de la persona docente en una mesa aparte. En la mesa de apoyo se repasan las casillas de tenedor con el caballo.</w:t>
             </w:r>
           </w:p>
         </w:tc>
@@ -8364,7 +8364,7 @@
             </w:pPr>
             <w:r/>
             <w:r>
-              <w:t>La persona docente monta una horquilla de caballo sobre una dama y una torre y pregunta: «¿Ya está todo perdido?».</w:t>
+              <w:t>La persona docente monta un tenedor de caballo sobre una dama y una torre y pregunta: «¿Ya está todo perdido?».</w:t>
             </w:r>
           </w:p>
         </w:tc>
@@ -8611,7 +8611,7 @@
               <w:rPr>
                 <w:b/>
               </w:rPr>
-              <w:t>Vigilar las casillas de horquilla</w:t>
+              <w:t>Vigilar las casillas de tenedor</w:t>
             </w:r>
           </w:p>
         </w:tc>
@@ -8776,7 +8776,7 @@
             </w:pPr>
             <w:r/>
             <w:r>
-              <w:t>La persona docente muestra en el tablero mural posiciones con rey, dama y torre en casillas del mismo color y explica por qué son vulnerables a la horquilla.</w:t>
+              <w:t>La persona docente muestra en el tablero mural posiciones con rey, dama y torre en casillas del mismo color y explica por qué son vulnerables al tenedor.</w:t>
             </w:r>
           </w:p>
         </w:tc>
@@ -8809,7 +8809,7 @@
             </w:pPr>
             <w:r/>
             <w:r>
-              <w:t>Cada estudiante escribe una regla propia para no recibir horquillas.</w:t>
+              <w:t>Cada estudiante escribe una regla propia para no recibir tenedores.</w:t>
             </w:r>
           </w:p>
         </w:tc>

</xml_diff>